<commit_message>
cleaning code and deciding whether to change vectors
</commit_message>
<xml_diff>
--- a/ECO499Undergraduatethesis.docx
+++ b/ECO499Undergraduatethesis.docx
@@ -129,7 +129,16 @@
           <w:kern w:val="0"/>
           <w14:ligatures w14:val="none"/>
         </w:rPr>
-        <w:t xml:space="preserve"> thesis submitted to the School of Business</w:t>
+        <w:t xml:space="preserve"> thesis submitted to the </w:t>
+      </w:r>
+      <w:r>
+        <w:rPr>
+          <w:rFonts w:ascii="Times New Roman" w:eastAsia="Times New Roman" w:hAnsi="Times New Roman" w:cs="Times New Roman"/>
+          <w:color w:val="1C1D1E"/>
+          <w:kern w:val="0"/>
+          <w14:ligatures w14:val="none"/>
+        </w:rPr>
+        <w:t>Department of Business and Economics</w:t>
       </w:r>
     </w:p>
     <w:p>
@@ -826,6 +835,14 @@
         </w:rPr>
         <w:br/>
       </w:r>
+      <w:r>
+        <w:rPr>
+          <w:rFonts w:ascii="Times New Roman" w:eastAsia="Times New Roman" w:hAnsi="Times New Roman" w:cs="Times New Roman"/>
+          <w:kern w:val="0"/>
+          <w14:ligatures w14:val="none"/>
+        </w:rPr>
+        <w:t xml:space="preserve">Change this page number take it out </w:t>
+      </w:r>
     </w:p>
     <w:p>
       <w:pPr>
@@ -1033,73 +1050,17 @@
         <w:spacing w:line="480" w:lineRule="auto"/>
         <w:rPr>
           <w:rFonts w:ascii="Times New Roman" w:eastAsia="Times New Roman" w:hAnsi="Times New Roman" w:cs="Times New Roman"/>
-          <w:b/>
-          <w:bCs/>
-          <w:color w:val="1C1D1E"/>
-          <w:kern w:val="0"/>
-          <w14:ligatures w14:val="none"/>
-        </w:rPr>
-      </w:pPr>
-    </w:p>
-    <w:p>
-      <w:pPr>
-        <w:spacing w:line="480" w:lineRule="auto"/>
-        <w:rPr>
-          <w:rFonts w:ascii="Times New Roman" w:eastAsia="Times New Roman" w:hAnsi="Times New Roman" w:cs="Times New Roman"/>
-          <w:b/>
-          <w:bCs/>
-          <w:color w:val="1C1D1E"/>
-          <w:kern w:val="0"/>
-          <w14:ligatures w14:val="none"/>
-        </w:rPr>
-      </w:pPr>
-    </w:p>
-    <w:p>
-      <w:pPr>
-        <w:spacing w:line="480" w:lineRule="auto"/>
-        <w:rPr>
-          <w:rFonts w:ascii="Times New Roman" w:eastAsia="Times New Roman" w:hAnsi="Times New Roman" w:cs="Times New Roman"/>
-          <w:b/>
-          <w:bCs/>
-          <w:color w:val="1C1D1E"/>
-          <w:kern w:val="0"/>
-          <w14:ligatures w14:val="none"/>
-        </w:rPr>
-      </w:pPr>
-    </w:p>
-    <w:p>
-      <w:pPr>
-        <w:spacing w:line="480" w:lineRule="auto"/>
-        <w:rPr>
-          <w:rFonts w:ascii="Times New Roman" w:eastAsia="Times New Roman" w:hAnsi="Times New Roman" w:cs="Times New Roman"/>
-          <w:b/>
-          <w:bCs/>
-          <w:color w:val="1C1D1E"/>
-          <w:kern w:val="0"/>
-          <w14:ligatures w14:val="none"/>
-        </w:rPr>
-      </w:pPr>
-    </w:p>
-    <w:p>
-      <w:pPr>
-        <w:spacing w:line="480" w:lineRule="auto"/>
-        <w:rPr>
-          <w:rFonts w:ascii="Times New Roman" w:eastAsia="Times New Roman" w:hAnsi="Times New Roman" w:cs="Times New Roman"/>
-          <w:b/>
-          <w:bCs/>
-          <w:color w:val="1C1D1E"/>
-          <w:kern w:val="0"/>
-          <w14:ligatures w14:val="none"/>
-        </w:rPr>
-      </w:pPr>
-    </w:p>
-    <w:p>
-      <w:pPr>
-        <w:spacing w:line="480" w:lineRule="auto"/>
-        <w:rPr>
-          <w:rFonts w:ascii="Times New Roman" w:eastAsia="Times New Roman" w:hAnsi="Times New Roman" w:cs="Times New Roman"/>
-          <w:b/>
-          <w:bCs/>
+          <w:color w:val="1C1D1E"/>
+          <w:kern w:val="0"/>
+          <w14:ligatures w14:val="none"/>
+        </w:rPr>
+      </w:pPr>
+    </w:p>
+    <w:p>
+      <w:pPr>
+        <w:spacing w:line="480" w:lineRule="auto"/>
+        <w:rPr>
+          <w:rFonts w:ascii="Times New Roman" w:eastAsia="Times New Roman" w:hAnsi="Times New Roman" w:cs="Times New Roman"/>
           <w:color w:val="1C1D1E"/>
           <w:kern w:val="0"/>
           <w14:ligatures w14:val="none"/>
@@ -1257,7 +1218,47 @@
           <w:kern w:val="0"/>
           <w14:ligatures w14:val="none"/>
         </w:rPr>
-        <w:t xml:space="preserve">Research from Blanchard and Katz have shown that people move away from areas with economic negative shocks to find a different job. Though later theory points out in Dao’s research that after 1990 </w:t>
+        <w:t xml:space="preserve">Research from Blanchard and Katz have shown that people move away from areas with economic negative shocks to find a different job. Though later theory points out in Dao’s research that after 1990 workers stopped moving away from economic shocks meaning that local unemployment and labor force had to adapt to the economic shocks. Which leads to other research Molloy, Smith, Wozniak finding that interstate migration has declined for three decades. Molloy points out that the drop is due to less job-related moves. </w:t>
+      </w:r>
+      <w:proofErr w:type="spellStart"/>
+      <w:r>
+        <w:rPr>
+          <w:rFonts w:ascii="Times New Roman" w:eastAsia="Times New Roman" w:hAnsi="Times New Roman" w:cs="Times New Roman"/>
+          <w:color w:val="1C1D1E"/>
+          <w:kern w:val="0"/>
+          <w14:ligatures w14:val="none"/>
+        </w:rPr>
+        <w:t>Monras</w:t>
+      </w:r>
+      <w:proofErr w:type="spellEnd"/>
+      <w:r>
+        <w:rPr>
+          <w:rFonts w:ascii="Times New Roman" w:eastAsia="Times New Roman" w:hAnsi="Times New Roman" w:cs="Times New Roman"/>
+          <w:color w:val="1C1D1E"/>
+          <w:kern w:val="0"/>
+          <w14:ligatures w14:val="none"/>
+        </w:rPr>
+        <w:t xml:space="preserve">, Yagan, and </w:t>
+      </w:r>
+      <w:proofErr w:type="spellStart"/>
+      <w:r>
+        <w:rPr>
+          <w:rFonts w:ascii="Times New Roman" w:eastAsia="Times New Roman" w:hAnsi="Times New Roman" w:cs="Times New Roman"/>
+          <w:color w:val="1C1D1E"/>
+          <w:kern w:val="0"/>
+          <w14:ligatures w14:val="none"/>
+        </w:rPr>
+        <w:t>Notowidigdo</w:t>
+      </w:r>
+      <w:proofErr w:type="spellEnd"/>
+      <w:r>
+        <w:rPr>
+          <w:rFonts w:ascii="Times New Roman" w:eastAsia="Times New Roman" w:hAnsi="Times New Roman" w:cs="Times New Roman"/>
+          <w:color w:val="1C1D1E"/>
+          <w:kern w:val="0"/>
+          <w14:ligatures w14:val="none"/>
+        </w:rPr>
+        <w:t xml:space="preserve"> show in recent </w:t>
       </w:r>
       <w:r>
         <w:rPr>
@@ -1267,7 +1268,7 @@
           <w14:ligatures w14:val="none"/>
         </w:rPr>
         <w:lastRenderedPageBreak/>
-        <w:t xml:space="preserve">workers stopped moving away from economic shocks meaning that local unemployment and labor force had to adapt to the economic shocks. Which leads to other research Molloy, Smith, Wozniak finding that interstate migration has declined for three decades. Molloy points out that the drop is due to less job-related moves. </w:t>
+        <w:t xml:space="preserve">studies from 2018-2020 people are more inclined to move into cities with economic boost than to move out struggling cities with economic shocks. </w:t>
       </w:r>
       <w:proofErr w:type="spellStart"/>
       <w:r>
@@ -1277,7 +1278,7 @@
           <w:kern w:val="0"/>
           <w14:ligatures w14:val="none"/>
         </w:rPr>
-        <w:t>Monras</w:t>
+        <w:t>Notowidigdo</w:t>
       </w:r>
       <w:proofErr w:type="spellEnd"/>
       <w:r>
@@ -1287,7 +1288,43 @@
           <w:kern w:val="0"/>
           <w14:ligatures w14:val="none"/>
         </w:rPr>
-        <w:t xml:space="preserve">, Yagan, and </w:t>
+        <w:t xml:space="preserve"> points out that low-income areas</w:t>
+      </w:r>
+      <w:r>
+        <w:rPr>
+          <w:rFonts w:ascii="Times New Roman" w:eastAsia="Times New Roman" w:hAnsi="Times New Roman" w:cs="Times New Roman"/>
+          <w:color w:val="1C1D1E"/>
+          <w:kern w:val="0"/>
+          <w14:ligatures w14:val="none"/>
+        </w:rPr>
+        <w:t xml:space="preserve"> have low house prices and government assistance to help low-skilled workers lower their need to move. Measuring all the effects both economically, demographically, and individual choice Alicia Sasser developed a way to use </w:t>
+      </w:r>
+      <w:r>
+        <w:rPr>
+          <w:rFonts w:ascii="Times New Roman" w:eastAsia="Times New Roman" w:hAnsi="Times New Roman" w:cs="Times New Roman"/>
+          <w:color w:val="1C1D1E"/>
+          <w:kern w:val="0"/>
+          <w14:ligatures w14:val="none"/>
+        </w:rPr>
+        <w:t xml:space="preserve">30 years of </w:t>
+      </w:r>
+      <w:r>
+        <w:rPr>
+          <w:rFonts w:ascii="Times New Roman" w:eastAsia="Times New Roman" w:hAnsi="Times New Roman" w:cs="Times New Roman"/>
+          <w:color w:val="1C1D1E"/>
+          <w:kern w:val="0"/>
+          <w14:ligatures w14:val="none"/>
+        </w:rPr>
+        <w:t>IRS migration data to study state to state movement</w:t>
+      </w:r>
+      <w:r>
+        <w:rPr>
+          <w:rFonts w:ascii="Times New Roman" w:eastAsia="Times New Roman" w:hAnsi="Times New Roman" w:cs="Times New Roman"/>
+          <w:color w:val="1C1D1E"/>
+          <w:kern w:val="0"/>
+          <w14:ligatures w14:val="none"/>
+        </w:rPr>
+        <w:t xml:space="preserve">. The models she created focused on unemployment insurance claims rate, real per capita income, and housing affordability index. Lagging the variables by one year to prevent </w:t>
       </w:r>
       <w:proofErr w:type="spellStart"/>
       <w:r>
@@ -1297,7 +1334,7 @@
           <w:kern w:val="0"/>
           <w14:ligatures w14:val="none"/>
         </w:rPr>
-        <w:t>Notowidigdo</w:t>
+        <w:t>casuality</w:t>
       </w:r>
       <w:proofErr w:type="spellEnd"/>
       <w:r>
@@ -1307,201 +1344,849 @@
           <w:kern w:val="0"/>
           <w14:ligatures w14:val="none"/>
         </w:rPr>
-        <w:t xml:space="preserve"> show in recent studies from 2018-2020 people are more inclined to move into cities with economic boost than to move out struggling cities with economic shocks. </w:t>
+        <w:t xml:space="preserve"> and applied state and year fixed effects to control differences in region and business cycles. These migration studies show how there has been a change throughout the years in how interstate migration is affected by economic shocks, housing affordability, and labor market conditions. Using the methods of Sasser’s economic variables between years 2017-2023 we can compare how the pandemic has shifted the relationship of economic variables with interstate migration. </w:t>
+      </w:r>
+    </w:p>
+    <w:p>
+      <w:pPr>
+        <w:spacing w:line="480" w:lineRule="auto"/>
+        <w:rPr>
+          <w:rFonts w:ascii="Times New Roman" w:eastAsia="Times New Roman" w:hAnsi="Times New Roman" w:cs="Times New Roman"/>
+          <w:b/>
+          <w:bCs/>
+          <w:color w:val="1C1D1E"/>
+          <w:kern w:val="0"/>
+          <w14:ligatures w14:val="none"/>
+        </w:rPr>
+      </w:pPr>
+    </w:p>
+    <w:p>
+      <w:pPr>
+        <w:spacing w:line="480" w:lineRule="auto"/>
+        <w:rPr>
+          <w:rFonts w:ascii="Times New Roman" w:eastAsia="Times New Roman" w:hAnsi="Times New Roman" w:cs="Times New Roman"/>
+          <w:b/>
+          <w:bCs/>
+          <w:color w:val="1C1D1E"/>
+          <w:kern w:val="0"/>
+          <w14:ligatures w14:val="none"/>
+        </w:rPr>
+      </w:pPr>
+    </w:p>
+    <w:p>
+      <w:pPr>
+        <w:spacing w:line="480" w:lineRule="auto"/>
+        <w:rPr>
+          <w:rFonts w:ascii="Times New Roman" w:eastAsia="Times New Roman" w:hAnsi="Times New Roman" w:cs="Times New Roman"/>
+          <w:b/>
+          <w:bCs/>
+          <w:color w:val="1C1D1E"/>
+          <w:kern w:val="0"/>
+          <w14:ligatures w14:val="none"/>
+        </w:rPr>
+      </w:pPr>
+    </w:p>
+    <w:p>
+      <w:pPr>
+        <w:spacing w:line="480" w:lineRule="auto"/>
+        <w:rPr>
+          <w:rFonts w:ascii="Times New Roman" w:eastAsia="Times New Roman" w:hAnsi="Times New Roman" w:cs="Times New Roman"/>
+          <w:b/>
+          <w:bCs/>
+          <w:color w:val="1C1D1E"/>
+          <w:kern w:val="0"/>
+          <w14:ligatures w14:val="none"/>
+        </w:rPr>
+      </w:pPr>
+      <w:r>
+        <w:rPr>
+          <w:rFonts w:ascii="Times New Roman" w:eastAsia="Times New Roman" w:hAnsi="Times New Roman" w:cs="Times New Roman"/>
+          <w:b/>
+          <w:bCs/>
+          <w:color w:val="1C1D1E"/>
+          <w:kern w:val="0"/>
+          <w14:ligatures w14:val="none"/>
+        </w:rPr>
+        <w:t xml:space="preserve">(put year after author) </w:t>
+      </w:r>
+    </w:p>
+    <w:p>
+      <w:pPr>
+        <w:spacing w:line="480" w:lineRule="auto"/>
+        <w:rPr>
+          <w:rFonts w:ascii="Times New Roman" w:eastAsia="Times New Roman" w:hAnsi="Times New Roman" w:cs="Times New Roman"/>
+          <w:b/>
+          <w:bCs/>
+          <w:color w:val="1C1D1E"/>
+          <w:kern w:val="0"/>
+          <w14:ligatures w14:val="none"/>
+        </w:rPr>
+      </w:pPr>
+      <w:r>
+        <w:rPr>
+          <w:rFonts w:ascii="Times New Roman" w:eastAsia="Times New Roman" w:hAnsi="Times New Roman" w:cs="Times New Roman"/>
+          <w:b/>
+          <w:bCs/>
+          <w:color w:val="1C1D1E"/>
+          <w:kern w:val="0"/>
+          <w14:ligatures w14:val="none"/>
+        </w:rPr>
+        <w:t xml:space="preserve">More explanation more in-depth </w:t>
+      </w:r>
+    </w:p>
+    <w:p>
+      <w:pPr>
+        <w:spacing w:line="480" w:lineRule="auto"/>
+        <w:rPr>
+          <w:rFonts w:ascii="Times New Roman" w:eastAsia="Times New Roman" w:hAnsi="Times New Roman" w:cs="Times New Roman"/>
+          <w:b/>
+          <w:bCs/>
+          <w:color w:val="1C1D1E"/>
+          <w:kern w:val="0"/>
+          <w14:ligatures w14:val="none"/>
+        </w:rPr>
+      </w:pPr>
+      <w:r>
+        <w:rPr>
+          <w:rFonts w:ascii="Times New Roman" w:eastAsia="Times New Roman" w:hAnsi="Times New Roman" w:cs="Times New Roman"/>
+          <w:b/>
+          <w:bCs/>
+          <w:color w:val="1C1D1E"/>
+          <w:kern w:val="0"/>
+          <w14:ligatures w14:val="none"/>
+        </w:rPr>
+        <w:t xml:space="preserve">Smooth transitions </w:t>
+      </w:r>
+    </w:p>
+    <w:p>
+      <w:pPr>
+        <w:spacing w:line="480" w:lineRule="auto"/>
+        <w:rPr>
+          <w:rFonts w:ascii="Times New Roman" w:eastAsia="Times New Roman" w:hAnsi="Times New Roman" w:cs="Times New Roman"/>
+          <w:b/>
+          <w:bCs/>
+          <w:color w:val="1C1D1E"/>
+          <w:kern w:val="0"/>
+          <w14:ligatures w14:val="none"/>
+        </w:rPr>
+      </w:pPr>
+      <w:r>
+        <w:rPr>
+          <w:rFonts w:ascii="Times New Roman" w:eastAsia="Times New Roman" w:hAnsi="Times New Roman" w:cs="Times New Roman"/>
+          <w:b/>
+          <w:bCs/>
+          <w:color w:val="1C1D1E"/>
+          <w:kern w:val="0"/>
+          <w14:ligatures w14:val="none"/>
+        </w:rPr>
+        <w:t xml:space="preserve">Add more authors look back into research </w:t>
       </w:r>
       <w:proofErr w:type="spellStart"/>
       <w:r>
         <w:rPr>
           <w:rFonts w:ascii="Times New Roman" w:eastAsia="Times New Roman" w:hAnsi="Times New Roman" w:cs="Times New Roman"/>
-          <w:color w:val="1C1D1E"/>
-          <w:kern w:val="0"/>
-          <w14:ligatures w14:val="none"/>
-        </w:rPr>
-        <w:t>Notowidigdo</w:t>
+          <w:b/>
+          <w:bCs/>
+          <w:color w:val="1C1D1E"/>
+          <w:kern w:val="0"/>
+          <w14:ligatures w14:val="none"/>
+        </w:rPr>
+        <w:t>et.all</w:t>
       </w:r>
       <w:proofErr w:type="spellEnd"/>
       <w:r>
         <w:rPr>
           <w:rFonts w:ascii="Times New Roman" w:eastAsia="Times New Roman" w:hAnsi="Times New Roman" w:cs="Times New Roman"/>
-          <w:color w:val="1C1D1E"/>
-          <w:kern w:val="0"/>
-          <w14:ligatures w14:val="none"/>
-        </w:rPr>
-        <w:t xml:space="preserve"> points out that low-income areas</w:t>
-      </w:r>
-      <w:r>
-        <w:rPr>
-          <w:rFonts w:ascii="Times New Roman" w:eastAsia="Times New Roman" w:hAnsi="Times New Roman" w:cs="Times New Roman"/>
-          <w:color w:val="1C1D1E"/>
-          <w:kern w:val="0"/>
-          <w14:ligatures w14:val="none"/>
-        </w:rPr>
-        <w:t xml:space="preserve"> have low house prices and government assistance to help low-skilled workers lower their need to move. Measuring all the effects both economically, demographically, and individual choice Alicia Sasser developed a way to use </w:t>
-      </w:r>
-      <w:r>
-        <w:rPr>
-          <w:rFonts w:ascii="Times New Roman" w:eastAsia="Times New Roman" w:hAnsi="Times New Roman" w:cs="Times New Roman"/>
-          <w:color w:val="1C1D1E"/>
-          <w:kern w:val="0"/>
-          <w14:ligatures w14:val="none"/>
-        </w:rPr>
-        <w:t xml:space="preserve">30 years of </w:t>
-      </w:r>
-      <w:r>
-        <w:rPr>
-          <w:rFonts w:ascii="Times New Roman" w:eastAsia="Times New Roman" w:hAnsi="Times New Roman" w:cs="Times New Roman"/>
-          <w:color w:val="1C1D1E"/>
-          <w:kern w:val="0"/>
-          <w14:ligatures w14:val="none"/>
-        </w:rPr>
-        <w:t>IRS migration data to study state to state movement</w:t>
-      </w:r>
-      <w:r>
-        <w:rPr>
-          <w:rFonts w:ascii="Times New Roman" w:eastAsia="Times New Roman" w:hAnsi="Times New Roman" w:cs="Times New Roman"/>
-          <w:color w:val="1C1D1E"/>
-          <w:kern w:val="0"/>
-          <w14:ligatures w14:val="none"/>
-        </w:rPr>
-        <w:t xml:space="preserve">. The models she created focused on unemployment insurance claims rate, real per capita income, and housing affordability index. Lagging the variables by one year to prevent </w:t>
+          <w:b/>
+          <w:bCs/>
+          <w:color w:val="1C1D1E"/>
+          <w:kern w:val="0"/>
+          <w14:ligatures w14:val="none"/>
+        </w:rPr>
+        <w:t xml:space="preserve">. if more authors on the paper if its two authors use two of their names </w:t>
+      </w:r>
+    </w:p>
+    <w:p>
+      <w:pPr>
+        <w:spacing w:line="480" w:lineRule="auto"/>
+        <w:rPr>
+          <w:rFonts w:ascii="Times New Roman" w:eastAsia="Times New Roman" w:hAnsi="Times New Roman" w:cs="Times New Roman"/>
+          <w:b/>
+          <w:bCs/>
+          <w:color w:val="1C1D1E"/>
+          <w:kern w:val="0"/>
+          <w14:ligatures w14:val="none"/>
+        </w:rPr>
+      </w:pPr>
+      <w:r>
+        <w:rPr>
+          <w:rFonts w:ascii="Times New Roman" w:eastAsia="Times New Roman" w:hAnsi="Times New Roman" w:cs="Times New Roman"/>
+          <w:b/>
+          <w:bCs/>
+          <w:color w:val="1C1D1E"/>
+          <w:kern w:val="0"/>
+          <w14:ligatures w14:val="none"/>
+        </w:rPr>
+        <w:t xml:space="preserve">More credit </w:t>
+      </w:r>
+    </w:p>
+    <w:p>
+      <w:pPr>
+        <w:spacing w:line="480" w:lineRule="auto"/>
+        <w:rPr>
+          <w:rFonts w:ascii="Times New Roman" w:eastAsia="Times New Roman" w:hAnsi="Times New Roman" w:cs="Times New Roman"/>
+          <w:b/>
+          <w:bCs/>
+          <w:color w:val="1C1D1E"/>
+          <w:kern w:val="0"/>
+          <w14:ligatures w14:val="none"/>
+        </w:rPr>
+      </w:pPr>
+      <w:r>
+        <w:rPr>
+          <w:rFonts w:ascii="Times New Roman" w:eastAsia="Times New Roman" w:hAnsi="Times New Roman" w:cs="Times New Roman"/>
+          <w:b/>
+          <w:bCs/>
+          <w:color w:val="1C1D1E"/>
+          <w:kern w:val="0"/>
+          <w14:ligatures w14:val="none"/>
+        </w:rPr>
+        <w:t xml:space="preserve">For all 48 states average by region northeast south </w:t>
       </w:r>
       <w:proofErr w:type="spellStart"/>
       <w:r>
         <w:rPr>
           <w:rFonts w:ascii="Times New Roman" w:eastAsia="Times New Roman" w:hAnsi="Times New Roman" w:cs="Times New Roman"/>
-          <w:color w:val="1C1D1E"/>
-          <w:kern w:val="0"/>
-          <w14:ligatures w14:val="none"/>
-        </w:rPr>
-        <w:t>casuality</w:t>
+          <w:b/>
+          <w:bCs/>
+          <w:color w:val="1C1D1E"/>
+          <w:kern w:val="0"/>
+          <w14:ligatures w14:val="none"/>
+        </w:rPr>
+        <w:t>etc</w:t>
       </w:r>
       <w:proofErr w:type="spellEnd"/>
-      <w:r>
-        <w:rPr>
-          <w:rFonts w:ascii="Times New Roman" w:eastAsia="Times New Roman" w:hAnsi="Times New Roman" w:cs="Times New Roman"/>
-          <w:color w:val="1C1D1E"/>
-          <w:kern w:val="0"/>
-          <w14:ligatures w14:val="none"/>
-        </w:rPr>
-        <w:t xml:space="preserve"> and applied state and year fixed effects to control differences in region and business cycles. These migration studies show how there has been a change throughout the years in how interstate migration is affected by economic shocks, housing affordability, and labor market conditions. Using the methods of Sasser’s economic variables between years 2017-2023 we can compare how the pandemic has shifted the relationship of economic variables with interstate migration. </w:t>
-      </w:r>
-    </w:p>
-    <w:p>
-      <w:pPr>
-        <w:spacing w:line="480" w:lineRule="auto"/>
-        <w:rPr>
-          <w:rFonts w:ascii="Times New Roman" w:eastAsia="Times New Roman" w:hAnsi="Times New Roman" w:cs="Times New Roman"/>
-          <w:b/>
-          <w:bCs/>
-          <w:color w:val="1C1D1E"/>
-          <w:kern w:val="0"/>
-          <w14:ligatures w14:val="none"/>
-        </w:rPr>
-      </w:pPr>
-    </w:p>
-    <w:p>
-      <w:pPr>
-        <w:spacing w:line="480" w:lineRule="auto"/>
-        <w:rPr>
-          <w:rFonts w:ascii="Times New Roman" w:eastAsia="Times New Roman" w:hAnsi="Times New Roman" w:cs="Times New Roman"/>
-          <w:b/>
-          <w:bCs/>
-          <w:color w:val="1C1D1E"/>
-          <w:kern w:val="0"/>
-          <w14:ligatures w14:val="none"/>
-        </w:rPr>
-      </w:pPr>
-    </w:p>
-    <w:p>
-      <w:pPr>
-        <w:spacing w:line="480" w:lineRule="auto"/>
-        <w:rPr>
-          <w:rFonts w:ascii="Times New Roman" w:eastAsia="Times New Roman" w:hAnsi="Times New Roman" w:cs="Times New Roman"/>
-          <w:b/>
-          <w:bCs/>
-          <w:color w:val="1C1D1E"/>
-          <w:kern w:val="0"/>
-          <w14:ligatures w14:val="none"/>
-        </w:rPr>
-      </w:pPr>
-    </w:p>
-    <w:p>
-      <w:pPr>
-        <w:spacing w:line="480" w:lineRule="auto"/>
-        <w:rPr>
-          <w:rFonts w:ascii="Times New Roman" w:eastAsia="Times New Roman" w:hAnsi="Times New Roman" w:cs="Times New Roman"/>
-          <w:b/>
-          <w:bCs/>
-          <w:color w:val="1C1D1E"/>
-          <w:kern w:val="0"/>
-          <w14:ligatures w14:val="none"/>
-        </w:rPr>
-      </w:pPr>
-    </w:p>
-    <w:p>
-      <w:pPr>
-        <w:spacing w:line="480" w:lineRule="auto"/>
-        <w:rPr>
-          <w:rFonts w:ascii="Times New Roman" w:eastAsia="Times New Roman" w:hAnsi="Times New Roman" w:cs="Times New Roman"/>
-          <w:b/>
-          <w:bCs/>
-          <w:color w:val="1C1D1E"/>
-          <w:kern w:val="0"/>
-          <w14:ligatures w14:val="none"/>
-        </w:rPr>
-      </w:pPr>
-    </w:p>
-    <w:p>
-      <w:pPr>
-        <w:spacing w:line="480" w:lineRule="auto"/>
-        <w:rPr>
-          <w:rFonts w:ascii="Times New Roman" w:eastAsia="Times New Roman" w:hAnsi="Times New Roman" w:cs="Times New Roman"/>
-          <w:b/>
-          <w:bCs/>
-          <w:color w:val="1C1D1E"/>
-          <w:kern w:val="0"/>
-          <w14:ligatures w14:val="none"/>
-        </w:rPr>
-      </w:pPr>
-    </w:p>
-    <w:p>
-      <w:pPr>
-        <w:spacing w:line="480" w:lineRule="auto"/>
-        <w:rPr>
-          <w:rFonts w:ascii="Times New Roman" w:eastAsia="Times New Roman" w:hAnsi="Times New Roman" w:cs="Times New Roman"/>
-          <w:b/>
-          <w:bCs/>
-          <w:color w:val="1C1D1E"/>
-          <w:kern w:val="0"/>
-          <w14:ligatures w14:val="none"/>
-        </w:rPr>
-      </w:pPr>
-    </w:p>
-    <w:p>
-      <w:pPr>
-        <w:spacing w:line="480" w:lineRule="auto"/>
-        <w:rPr>
-          <w:rFonts w:ascii="Times New Roman" w:eastAsia="Times New Roman" w:hAnsi="Times New Roman" w:cs="Times New Roman"/>
-          <w:b/>
-          <w:bCs/>
-          <w:color w:val="1C1D1E"/>
-          <w:kern w:val="0"/>
-          <w14:ligatures w14:val="none"/>
-        </w:rPr>
-      </w:pPr>
-    </w:p>
-    <w:p>
-      <w:pPr>
-        <w:spacing w:line="480" w:lineRule="auto"/>
-        <w:rPr>
-          <w:rFonts w:ascii="Times New Roman" w:eastAsia="Times New Roman" w:hAnsi="Times New Roman" w:cs="Times New Roman"/>
-          <w:b/>
-          <w:bCs/>
-          <w:color w:val="1C1D1E"/>
-          <w:kern w:val="0"/>
-          <w14:ligatures w14:val="none"/>
-        </w:rPr>
-      </w:pPr>
+    </w:p>
+    <w:p>
+      <w:pPr>
+        <w:spacing w:line="480" w:lineRule="auto"/>
+        <w:rPr>
+          <w:rFonts w:ascii="Times New Roman" w:eastAsia="Times New Roman" w:hAnsi="Times New Roman" w:cs="Times New Roman"/>
+          <w:b/>
+          <w:bCs/>
+          <w:color w:val="1C1D1E"/>
+          <w:kern w:val="0"/>
+          <w14:ligatures w14:val="none"/>
+        </w:rPr>
+      </w:pPr>
+      <w:r>
+        <w:rPr>
+          <w:rFonts w:ascii="Times New Roman" w:eastAsia="Times New Roman" w:hAnsi="Times New Roman" w:cs="Times New Roman"/>
+          <w:b/>
+          <w:bCs/>
+          <w:color w:val="1C1D1E"/>
+          <w:kern w:val="0"/>
+          <w14:ligatures w14:val="none"/>
+        </w:rPr>
+        <w:lastRenderedPageBreak/>
+        <w:t xml:space="preserve">Comparative graphs of each variable </w:t>
+      </w:r>
+    </w:p>
+    <w:p>
+      <w:pPr>
+        <w:spacing w:line="480" w:lineRule="auto"/>
+        <w:rPr>
+          <w:rFonts w:ascii="Times New Roman" w:eastAsia="Times New Roman" w:hAnsi="Times New Roman" w:cs="Times New Roman"/>
+          <w:b/>
+          <w:bCs/>
+          <w:color w:val="1C1D1E"/>
+          <w:kern w:val="0"/>
+          <w14:ligatures w14:val="none"/>
+        </w:rPr>
+      </w:pPr>
+      <w:r>
+        <w:rPr>
+          <w:rFonts w:ascii="Times New Roman" w:eastAsia="Times New Roman" w:hAnsi="Times New Roman" w:cs="Times New Roman"/>
+          <w:b/>
+          <w:bCs/>
+          <w:color w:val="1C1D1E"/>
+          <w:kern w:val="0"/>
+          <w14:ligatures w14:val="none"/>
+        </w:rPr>
+        <w:t xml:space="preserve">t-test </w:t>
+      </w:r>
+    </w:p>
+    <w:p>
+      <w:pPr>
+        <w:spacing w:line="480" w:lineRule="auto"/>
+        <w:rPr>
+          <w:rFonts w:ascii="Times New Roman" w:eastAsia="Times New Roman" w:hAnsi="Times New Roman" w:cs="Times New Roman"/>
+          <w:b/>
+          <w:bCs/>
+          <w:color w:val="1C1D1E"/>
+          <w:kern w:val="0"/>
+          <w14:ligatures w14:val="none"/>
+        </w:rPr>
+      </w:pPr>
+      <w:r>
+        <w:rPr>
+          <w:rFonts w:ascii="Times New Roman" w:eastAsia="Times New Roman" w:hAnsi="Times New Roman" w:cs="Times New Roman"/>
+          <w:b/>
+          <w:bCs/>
+          <w:color w:val="1C1D1E"/>
+          <w:kern w:val="0"/>
+          <w14:ligatures w14:val="none"/>
+        </w:rPr>
+        <w:t xml:space="preserve">Deeper dive of </w:t>
+      </w:r>
+      <w:proofErr w:type="spellStart"/>
+      <w:r>
+        <w:rPr>
+          <w:rFonts w:ascii="Times New Roman" w:eastAsia="Times New Roman" w:hAnsi="Times New Roman" w:cs="Times New Roman"/>
+          <w:b/>
+          <w:bCs/>
+          <w:color w:val="1C1D1E"/>
+          <w:kern w:val="0"/>
+          <w14:ligatures w14:val="none"/>
+        </w:rPr>
+        <w:t>sasser</w:t>
+      </w:r>
+      <w:proofErr w:type="spellEnd"/>
+      <w:r>
+        <w:rPr>
+          <w:rFonts w:ascii="Times New Roman" w:eastAsia="Times New Roman" w:hAnsi="Times New Roman" w:cs="Times New Roman"/>
+          <w:b/>
+          <w:bCs/>
+          <w:color w:val="1C1D1E"/>
+          <w:kern w:val="0"/>
+          <w14:ligatures w14:val="none"/>
+        </w:rPr>
+        <w:t xml:space="preserve"> of 2 paragraphs more in-depth like a lab report </w:t>
+      </w:r>
+    </w:p>
+    <w:p>
+      <w:pPr>
+        <w:spacing w:line="480" w:lineRule="auto"/>
+        <w:rPr>
+          <w:rFonts w:ascii="Times New Roman" w:eastAsia="Times New Roman" w:hAnsi="Times New Roman" w:cs="Times New Roman"/>
+          <w:b/>
+          <w:bCs/>
+          <w:color w:val="1C1D1E"/>
+          <w:kern w:val="0"/>
+          <w14:ligatures w14:val="none"/>
+        </w:rPr>
+      </w:pPr>
+      <w:r>
+        <w:rPr>
+          <w:rFonts w:ascii="Times New Roman" w:eastAsia="Times New Roman" w:hAnsi="Times New Roman" w:cs="Times New Roman"/>
+          <w:b/>
+          <w:bCs/>
+          <w:color w:val="1C1D1E"/>
+          <w:kern w:val="0"/>
+          <w14:ligatures w14:val="none"/>
+        </w:rPr>
+        <w:t>Here is the data, where I got the data, and how I got the variables together write that next</w:t>
+      </w:r>
+    </w:p>
+    <w:p>
+      <w:pPr>
+        <w:spacing w:line="480" w:lineRule="auto"/>
+        <w:rPr>
+          <w:rFonts w:ascii="Times New Roman" w:eastAsia="Times New Roman" w:hAnsi="Times New Roman" w:cs="Times New Roman"/>
+          <w:b/>
+          <w:bCs/>
+          <w:color w:val="1C1D1E"/>
+          <w:kern w:val="0"/>
+          <w14:ligatures w14:val="none"/>
+        </w:rPr>
+      </w:pPr>
+      <w:r>
+        <w:rPr>
+          <w:rFonts w:ascii="Times New Roman" w:eastAsia="Times New Roman" w:hAnsi="Times New Roman" w:cs="Times New Roman"/>
+          <w:b/>
+          <w:bCs/>
+          <w:color w:val="1C1D1E"/>
+          <w:kern w:val="0"/>
+          <w14:ligatures w14:val="none"/>
+        </w:rPr>
+        <w:t xml:space="preserve">Then do exploratory analysis before and after and also before and after region </w:t>
+      </w:r>
+    </w:p>
+    <w:p>
+      <w:pPr>
+        <w:spacing w:line="480" w:lineRule="auto"/>
+        <w:rPr>
+          <w:rFonts w:ascii="Times New Roman" w:eastAsia="Times New Roman" w:hAnsi="Times New Roman" w:cs="Times New Roman"/>
+          <w:b/>
+          <w:bCs/>
+          <w:color w:val="1C1D1E"/>
+          <w:kern w:val="0"/>
+          <w14:ligatures w14:val="none"/>
+        </w:rPr>
+      </w:pPr>
+    </w:p>
+    <w:p>
+      <w:pPr>
+        <w:spacing w:line="480" w:lineRule="auto"/>
+        <w:rPr>
+          <w:rFonts w:ascii="Times New Roman" w:eastAsia="Times New Roman" w:hAnsi="Times New Roman" w:cs="Times New Roman"/>
+          <w:b/>
+          <w:bCs/>
+          <w:color w:val="1C1D1E"/>
+          <w:kern w:val="0"/>
+          <w14:ligatures w14:val="none"/>
+        </w:rPr>
+      </w:pPr>
+      <w:r>
+        <w:rPr>
+          <w:rFonts w:ascii="Times New Roman" w:eastAsia="Times New Roman" w:hAnsi="Times New Roman" w:cs="Times New Roman"/>
+          <w:b/>
+          <w:bCs/>
+          <w:color w:val="1C1D1E"/>
+          <w:kern w:val="0"/>
+          <w14:ligatures w14:val="none"/>
+        </w:rPr>
+        <w:t xml:space="preserve">Describe how you made every single variable what formula or etc </w:t>
+      </w:r>
+    </w:p>
+    <w:p>
+      <w:pPr>
+        <w:spacing w:line="480" w:lineRule="auto"/>
+        <w:rPr>
+          <w:rFonts w:ascii="Times New Roman" w:eastAsia="Times New Roman" w:hAnsi="Times New Roman" w:cs="Times New Roman"/>
+          <w:b/>
+          <w:bCs/>
+          <w:color w:val="1C1D1E"/>
+          <w:kern w:val="0"/>
+          <w14:ligatures w14:val="none"/>
+        </w:rPr>
+      </w:pPr>
+    </w:p>
+    <w:p>
+      <w:pPr>
+        <w:spacing w:line="480" w:lineRule="auto"/>
+        <w:rPr>
+          <w:rFonts w:ascii="Times New Roman" w:eastAsia="Times New Roman" w:hAnsi="Times New Roman" w:cs="Times New Roman"/>
+          <w:b/>
+          <w:bCs/>
+          <w:color w:val="1C1D1E"/>
+          <w:kern w:val="0"/>
+          <w14:ligatures w14:val="none"/>
+        </w:rPr>
+      </w:pPr>
+      <w:r>
+        <w:rPr>
+          <w:rFonts w:ascii="Times New Roman" w:eastAsia="Times New Roman" w:hAnsi="Times New Roman" w:cs="Times New Roman"/>
+          <w:b/>
+          <w:bCs/>
+          <w:color w:val="1C1D1E"/>
+          <w:kern w:val="0"/>
+          <w14:ligatures w14:val="none"/>
+        </w:rPr>
+        <w:t xml:space="preserve">Descriptive stats before empirical models </w:t>
+      </w:r>
+    </w:p>
+    <w:p>
+      <w:pPr>
+        <w:spacing w:line="480" w:lineRule="auto"/>
+        <w:rPr>
+          <w:rFonts w:ascii="Times New Roman" w:eastAsia="Times New Roman" w:hAnsi="Times New Roman" w:cs="Times New Roman"/>
+          <w:b/>
+          <w:bCs/>
+          <w:color w:val="1C1D1E"/>
+          <w:kern w:val="0"/>
+          <w14:ligatures w14:val="none"/>
+        </w:rPr>
+      </w:pPr>
+    </w:p>
+    <w:p>
+      <w:pPr>
+        <w:spacing w:line="480" w:lineRule="auto"/>
+        <w:rPr>
+          <w:rFonts w:ascii="Times New Roman" w:eastAsia="Times New Roman" w:hAnsi="Times New Roman" w:cs="Times New Roman"/>
+          <w:b/>
+          <w:bCs/>
+          <w:color w:val="1C1D1E"/>
+          <w:kern w:val="0"/>
+          <w14:ligatures w14:val="none"/>
+        </w:rPr>
+      </w:pPr>
+    </w:p>
+    <w:p>
+      <w:pPr>
+        <w:spacing w:line="480" w:lineRule="auto"/>
+        <w:rPr>
+          <w:rFonts w:ascii="Times New Roman" w:eastAsia="Times New Roman" w:hAnsi="Times New Roman" w:cs="Times New Roman"/>
+          <w:b/>
+          <w:bCs/>
+          <w:color w:val="1C1D1E"/>
+          <w:kern w:val="0"/>
+          <w14:ligatures w14:val="none"/>
+        </w:rPr>
+      </w:pPr>
+      <w:r>
+        <w:rPr>
+          <w:rFonts w:ascii="Times New Roman" w:eastAsia="Times New Roman" w:hAnsi="Times New Roman" w:cs="Times New Roman"/>
+          <w:b/>
+          <w:bCs/>
+          <w:color w:val="1C1D1E"/>
+          <w:kern w:val="0"/>
+          <w14:ligatures w14:val="none"/>
+        </w:rPr>
+        <w:t>Tables need to have same wording with doc cannot copy and paste it from R</w:t>
+      </w:r>
+    </w:p>
+    <w:p>
+      <w:pPr>
+        <w:spacing w:line="480" w:lineRule="auto"/>
+        <w:rPr>
+          <w:rFonts w:ascii="Times New Roman" w:eastAsia="Times New Roman" w:hAnsi="Times New Roman" w:cs="Times New Roman"/>
+          <w:b/>
+          <w:bCs/>
+          <w:color w:val="1C1D1E"/>
+          <w:kern w:val="0"/>
+          <w14:ligatures w14:val="none"/>
+        </w:rPr>
+      </w:pPr>
+    </w:p>
+    <w:p>
+      <w:pPr>
+        <w:spacing w:line="480" w:lineRule="auto"/>
+        <w:rPr>
+          <w:rFonts w:ascii="Times New Roman" w:eastAsia="Times New Roman" w:hAnsi="Times New Roman" w:cs="Times New Roman"/>
+          <w:b/>
+          <w:bCs/>
+          <w:color w:val="1C1D1E"/>
+          <w:kern w:val="0"/>
+          <w14:ligatures w14:val="none"/>
+        </w:rPr>
+      </w:pPr>
+    </w:p>
+    <w:p>
+      <w:pPr>
+        <w:spacing w:line="480" w:lineRule="auto"/>
+        <w:rPr>
+          <w:rFonts w:ascii="Times New Roman" w:eastAsia="Times New Roman" w:hAnsi="Times New Roman" w:cs="Times New Roman"/>
+          <w:b/>
+          <w:bCs/>
+          <w:color w:val="1C1D1E"/>
+          <w:kern w:val="0"/>
+          <w14:ligatures w14:val="none"/>
+        </w:rPr>
+      </w:pPr>
+      <w:r>
+        <w:rPr>
+          <w:rFonts w:ascii="Times New Roman" w:eastAsia="Times New Roman" w:hAnsi="Times New Roman" w:cs="Times New Roman"/>
+          <w:b/>
+          <w:bCs/>
+          <w:color w:val="1C1D1E"/>
+          <w:kern w:val="0"/>
+          <w14:ligatures w14:val="none"/>
+        </w:rPr>
+        <w:t xml:space="preserve">Have description </w:t>
+      </w:r>
+    </w:p>
+    <w:p>
+      <w:pPr>
+        <w:spacing w:line="480" w:lineRule="auto"/>
+        <w:rPr>
+          <w:rFonts w:ascii="Times New Roman" w:eastAsia="Times New Roman" w:hAnsi="Times New Roman" w:cs="Times New Roman"/>
+          <w:b/>
+          <w:bCs/>
+          <w:color w:val="1C1D1E"/>
+          <w:kern w:val="0"/>
+          <w14:ligatures w14:val="none"/>
+        </w:rPr>
+      </w:pPr>
+    </w:p>
+    <w:p>
+      <w:pPr>
+        <w:spacing w:line="480" w:lineRule="auto"/>
+        <w:rPr>
+          <w:rFonts w:ascii="Times New Roman" w:eastAsia="Times New Roman" w:hAnsi="Times New Roman" w:cs="Times New Roman"/>
+          <w:b/>
+          <w:bCs/>
+          <w:color w:val="1C1D1E"/>
+          <w:kern w:val="0"/>
+          <w14:ligatures w14:val="none"/>
+        </w:rPr>
+      </w:pPr>
+      <w:r>
+        <w:rPr>
+          <w:rFonts w:ascii="Times New Roman" w:eastAsia="Times New Roman" w:hAnsi="Times New Roman" w:cs="Times New Roman"/>
+          <w:b/>
+          <w:bCs/>
+          <w:color w:val="1C1D1E"/>
+          <w:kern w:val="0"/>
+          <w14:ligatures w14:val="none"/>
+        </w:rPr>
+        <w:t xml:space="preserve">Start references page </w:t>
+      </w:r>
+    </w:p>
+    <w:p>
+      <w:pPr>
+        <w:spacing w:line="480" w:lineRule="auto"/>
+        <w:rPr>
+          <w:rFonts w:ascii="Times New Roman" w:eastAsia="Times New Roman" w:hAnsi="Times New Roman" w:cs="Times New Roman"/>
+          <w:b/>
+          <w:bCs/>
+          <w:color w:val="1C1D1E"/>
+          <w:kern w:val="0"/>
+          <w14:ligatures w14:val="none"/>
+        </w:rPr>
+      </w:pPr>
+      <w:r>
+        <w:rPr>
+          <w:rFonts w:ascii="Times New Roman" w:eastAsia="Times New Roman" w:hAnsi="Times New Roman" w:cs="Times New Roman"/>
+          <w:b/>
+          <w:bCs/>
+          <w:color w:val="1C1D1E"/>
+          <w:kern w:val="0"/>
+          <w14:ligatures w14:val="none"/>
+        </w:rPr>
+        <w:t xml:space="preserve">Graph </w:t>
+      </w:r>
+    </w:p>
+    <w:p>
+      <w:pPr>
+        <w:spacing w:line="480" w:lineRule="auto"/>
+        <w:rPr>
+          <w:rFonts w:ascii="Times New Roman" w:eastAsia="Times New Roman" w:hAnsi="Times New Roman" w:cs="Times New Roman"/>
+          <w:b/>
+          <w:bCs/>
+          <w:color w:val="1C1D1E"/>
+          <w:kern w:val="0"/>
+          <w14:ligatures w14:val="none"/>
+        </w:rPr>
+      </w:pPr>
+      <w:r>
+        <w:rPr>
+          <w:rFonts w:ascii="Times New Roman" w:eastAsia="Times New Roman" w:hAnsi="Times New Roman" w:cs="Times New Roman"/>
+          <w:b/>
+          <w:bCs/>
+          <w:color w:val="1C1D1E"/>
+          <w:kern w:val="0"/>
+          <w14:ligatures w14:val="none"/>
+        </w:rPr>
+        <w:t xml:space="preserve">No need to graph every variable </w:t>
+      </w:r>
+    </w:p>
+    <w:p>
+      <w:pPr>
+        <w:spacing w:line="480" w:lineRule="auto"/>
+        <w:rPr>
+          <w:rFonts w:ascii="Times New Roman" w:eastAsia="Times New Roman" w:hAnsi="Times New Roman" w:cs="Times New Roman"/>
+          <w:b/>
+          <w:bCs/>
+          <w:color w:val="1C1D1E"/>
+          <w:kern w:val="0"/>
+          <w14:ligatures w14:val="none"/>
+        </w:rPr>
+      </w:pPr>
+      <w:r>
+        <w:rPr>
+          <w:rFonts w:ascii="Times New Roman" w:eastAsia="Times New Roman" w:hAnsi="Times New Roman" w:cs="Times New Roman"/>
+          <w:b/>
+          <w:bCs/>
+          <w:color w:val="1C1D1E"/>
+          <w:kern w:val="0"/>
+          <w14:ligatures w14:val="none"/>
+        </w:rPr>
+        <w:t xml:space="preserve">But expects variable </w:t>
+      </w:r>
+    </w:p>
+    <w:p>
+      <w:pPr>
+        <w:spacing w:line="480" w:lineRule="auto"/>
+        <w:rPr>
+          <w:rFonts w:ascii="Times New Roman" w:eastAsia="Times New Roman" w:hAnsi="Times New Roman" w:cs="Times New Roman"/>
+          <w:b/>
+          <w:bCs/>
+          <w:color w:val="1C1D1E"/>
+          <w:kern w:val="0"/>
+          <w14:ligatures w14:val="none"/>
+        </w:rPr>
+      </w:pPr>
+      <w:r>
+        <w:rPr>
+          <w:rFonts w:ascii="Times New Roman" w:eastAsia="Times New Roman" w:hAnsi="Times New Roman" w:cs="Times New Roman"/>
+          <w:b/>
+          <w:bCs/>
+          <w:color w:val="1C1D1E"/>
+          <w:kern w:val="0"/>
+          <w14:ligatures w14:val="none"/>
+        </w:rPr>
+        <w:t xml:space="preserve">Mean, </w:t>
+      </w:r>
+      <w:proofErr w:type="spellStart"/>
+      <w:r>
+        <w:rPr>
+          <w:rFonts w:ascii="Times New Roman" w:eastAsia="Times New Roman" w:hAnsi="Times New Roman" w:cs="Times New Roman"/>
+          <w:b/>
+          <w:bCs/>
+          <w:color w:val="1C1D1E"/>
+          <w:kern w:val="0"/>
+          <w14:ligatures w14:val="none"/>
+        </w:rPr>
+        <w:t>mediam</w:t>
+      </w:r>
+      <w:proofErr w:type="spellEnd"/>
+      <w:r>
+        <w:rPr>
+          <w:rFonts w:ascii="Times New Roman" w:eastAsia="Times New Roman" w:hAnsi="Times New Roman" w:cs="Times New Roman"/>
+          <w:b/>
+          <w:bCs/>
+          <w:color w:val="1C1D1E"/>
+          <w:kern w:val="0"/>
+          <w14:ligatures w14:val="none"/>
+        </w:rPr>
+        <w:t xml:space="preserve">, </w:t>
+      </w:r>
+      <w:proofErr w:type="spellStart"/>
+      <w:r>
+        <w:rPr>
+          <w:rFonts w:ascii="Times New Roman" w:eastAsia="Times New Roman" w:hAnsi="Times New Roman" w:cs="Times New Roman"/>
+          <w:b/>
+          <w:bCs/>
+          <w:color w:val="1C1D1E"/>
+          <w:kern w:val="0"/>
+          <w14:ligatures w14:val="none"/>
+        </w:rPr>
+        <w:t>stdev</w:t>
+      </w:r>
+      <w:proofErr w:type="spellEnd"/>
+      <w:r>
+        <w:rPr>
+          <w:rFonts w:ascii="Times New Roman" w:eastAsia="Times New Roman" w:hAnsi="Times New Roman" w:cs="Times New Roman"/>
+          <w:b/>
+          <w:bCs/>
+          <w:color w:val="1C1D1E"/>
+          <w:kern w:val="0"/>
+          <w14:ligatures w14:val="none"/>
+        </w:rPr>
+        <w:t>, range, IQR</w:t>
+      </w:r>
+    </w:p>
+    <w:p>
+      <w:pPr>
+        <w:spacing w:line="480" w:lineRule="auto"/>
+        <w:rPr>
+          <w:rFonts w:ascii="Times New Roman" w:eastAsia="Times New Roman" w:hAnsi="Times New Roman" w:cs="Times New Roman"/>
+          <w:b/>
+          <w:bCs/>
+          <w:color w:val="1C1D1E"/>
+          <w:kern w:val="0"/>
+          <w14:ligatures w14:val="none"/>
+        </w:rPr>
+      </w:pPr>
+      <w:r>
+        <w:rPr>
+          <w:rFonts w:ascii="Times New Roman" w:eastAsia="Times New Roman" w:hAnsi="Times New Roman" w:cs="Times New Roman"/>
+          <w:b/>
+          <w:bCs/>
+          <w:color w:val="1C1D1E"/>
+          <w:kern w:val="0"/>
+          <w14:ligatures w14:val="none"/>
+        </w:rPr>
+        <w:t>table</w:t>
+      </w:r>
+    </w:p>
+    <w:p>
+      <w:pPr>
+        <w:spacing w:line="480" w:lineRule="auto"/>
+        <w:rPr>
+          <w:rFonts w:ascii="Times New Roman" w:eastAsia="Times New Roman" w:hAnsi="Times New Roman" w:cs="Times New Roman"/>
+          <w:b/>
+          <w:bCs/>
+          <w:color w:val="1C1D1E"/>
+          <w:kern w:val="0"/>
+          <w14:ligatures w14:val="none"/>
+        </w:rPr>
+      </w:pPr>
+      <w:r>
+        <w:rPr>
+          <w:rFonts w:ascii="Times New Roman" w:eastAsia="Times New Roman" w:hAnsi="Times New Roman" w:cs="Times New Roman"/>
+          <w:b/>
+          <w:bCs/>
+          <w:color w:val="1C1D1E"/>
+          <w:kern w:val="0"/>
+          <w14:ligatures w14:val="none"/>
+        </w:rPr>
+        <w:t>graph region table</w:t>
+      </w:r>
+    </w:p>
+    <w:p>
+      <w:pPr>
+        <w:spacing w:line="480" w:lineRule="auto"/>
+        <w:rPr>
+          <w:rFonts w:ascii="Times New Roman" w:eastAsia="Times New Roman" w:hAnsi="Times New Roman" w:cs="Times New Roman"/>
+          <w:b/>
+          <w:bCs/>
+          <w:color w:val="1C1D1E"/>
+          <w:kern w:val="0"/>
+          <w14:ligatures w14:val="none"/>
+        </w:rPr>
+      </w:pPr>
+      <w:r>
+        <w:rPr>
+          <w:rFonts w:ascii="Times New Roman" w:eastAsia="Times New Roman" w:hAnsi="Times New Roman" w:cs="Times New Roman"/>
+          <w:b/>
+          <w:bCs/>
+          <w:color w:val="1C1D1E"/>
+          <w:kern w:val="0"/>
+          <w14:ligatures w14:val="none"/>
+        </w:rPr>
+        <w:lastRenderedPageBreak/>
+        <w:t xml:space="preserve">regression </w:t>
+      </w:r>
+    </w:p>
+    <w:p>
+      <w:pPr>
+        <w:spacing w:line="480" w:lineRule="auto"/>
+        <w:rPr>
+          <w:rFonts w:ascii="Times New Roman" w:eastAsia="Times New Roman" w:hAnsi="Times New Roman" w:cs="Times New Roman"/>
+          <w:b/>
+          <w:bCs/>
+          <w:color w:val="1C1D1E"/>
+          <w:kern w:val="0"/>
+          <w14:ligatures w14:val="none"/>
+        </w:rPr>
+      </w:pPr>
+      <w:r>
+        <w:rPr>
+          <w:rFonts w:ascii="Times New Roman" w:eastAsia="Times New Roman" w:hAnsi="Times New Roman" w:cs="Times New Roman"/>
+          <w:b/>
+          <w:bCs/>
+          <w:color w:val="1C1D1E"/>
+          <w:kern w:val="0"/>
+          <w14:ligatures w14:val="none"/>
+        </w:rPr>
+        <w:t>graphs for regression</w:t>
+      </w:r>
+    </w:p>
+    <w:p>
+      <w:pPr>
+        <w:spacing w:line="480" w:lineRule="auto"/>
+        <w:rPr>
+          <w:rFonts w:ascii="Times New Roman" w:eastAsia="Times New Roman" w:hAnsi="Times New Roman" w:cs="Times New Roman"/>
+          <w:b/>
+          <w:bCs/>
+          <w:color w:val="1C1D1E"/>
+          <w:kern w:val="0"/>
+          <w14:ligatures w14:val="none"/>
+        </w:rPr>
+      </w:pPr>
+      <w:r>
+        <w:rPr>
+          <w:rFonts w:ascii="Times New Roman" w:eastAsia="Times New Roman" w:hAnsi="Times New Roman" w:cs="Times New Roman"/>
+          <w:b/>
+          <w:bCs/>
+          <w:color w:val="1C1D1E"/>
+          <w:kern w:val="0"/>
+          <w14:ligatures w14:val="none"/>
+        </w:rPr>
+        <w:t xml:space="preserve">what is economic framework is what I should focus on </w:t>
+      </w:r>
     </w:p>
     <w:p>
       <w:pPr>
@@ -1975,31 +2660,11 @@
     </w:p>
     <w:p>
       <w:pPr>
-        <w:rPr>
-          <w:rFonts w:ascii="Times New Roman" w:eastAsia="Times New Roman" w:hAnsi="Times New Roman" w:cs="Times New Roman"/>
-          <w:kern w:val="0"/>
-          <w14:ligatures w14:val="none"/>
-        </w:rPr>
-      </w:pPr>
-    </w:p>
-    <w:p>
-      <w:pPr>
-        <w:spacing w:line="480" w:lineRule="auto"/>
-        <w:rPr>
-          <w:rFonts w:ascii="Times New Roman" w:eastAsia="Times New Roman" w:hAnsi="Times New Roman" w:cs="Times New Roman"/>
-          <w:kern w:val="0"/>
-          <w14:ligatures w14:val="none"/>
-        </w:rPr>
-      </w:pPr>
-    </w:p>
-    <w:p>
-      <w:pPr>
-        <w:rPr>
-          <w:rFonts w:ascii="Times New Roman" w:eastAsia="Times New Roman" w:hAnsi="Times New Roman" w:cs="Times New Roman"/>
-          <w:kern w:val="0"/>
-          <w14:ligatures w14:val="none"/>
-        </w:rPr>
-      </w:pPr>
+        <w:pStyle w:val="TOCHeading"/>
+      </w:pPr>
+      <w:r>
+        <w:t>Do table of contents later after everything is done or do it while you got ongoing papers done and add it when you finish the paper</w:t>
+      </w:r>
     </w:p>
     <w:p/>
     <w:sectPr>
@@ -3171,6 +3836,164 @@
     <w:unhideWhenUsed/>
     <w:rsid w:val="00430336"/>
   </w:style>
+  <w:style w:type="paragraph" w:styleId="TOCHeading">
+    <w:name w:val="TOC Heading"/>
+    <w:basedOn w:val="Heading1"/>
+    <w:next w:val="Normal"/>
+    <w:uiPriority w:val="39"/>
+    <w:unhideWhenUsed/>
+    <w:qFormat/>
+    <w:rsid w:val="00734BCF"/>
+    <w:pPr>
+      <w:spacing w:before="480" w:after="0" w:line="276" w:lineRule="auto"/>
+      <w:outlineLvl w:val="9"/>
+    </w:pPr>
+    <w:rPr>
+      <w:b/>
+      <w:bCs/>
+      <w:kern w:val="0"/>
+      <w:sz w:val="28"/>
+      <w:szCs w:val="28"/>
+      <w14:ligatures w14:val="none"/>
+    </w:rPr>
+  </w:style>
+  <w:style w:type="paragraph" w:styleId="TOC1">
+    <w:name w:val="toc 1"/>
+    <w:basedOn w:val="Normal"/>
+    <w:next w:val="Normal"/>
+    <w:autoRedefine/>
+    <w:uiPriority w:val="39"/>
+    <w:semiHidden/>
+    <w:unhideWhenUsed/>
+    <w:rsid w:val="00734BCF"/>
+    <w:pPr>
+      <w:spacing w:before="360" w:after="360"/>
+    </w:pPr>
+    <w:rPr>
+      <w:b/>
+      <w:bCs/>
+      <w:caps/>
+      <w:sz w:val="22"/>
+      <w:szCs w:val="22"/>
+      <w:u w:val="single"/>
+    </w:rPr>
+  </w:style>
+  <w:style w:type="paragraph" w:styleId="TOC2">
+    <w:name w:val="toc 2"/>
+    <w:basedOn w:val="Normal"/>
+    <w:next w:val="Normal"/>
+    <w:autoRedefine/>
+    <w:uiPriority w:val="39"/>
+    <w:semiHidden/>
+    <w:unhideWhenUsed/>
+    <w:rsid w:val="00734BCF"/>
+    <w:rPr>
+      <w:b/>
+      <w:bCs/>
+      <w:smallCaps/>
+      <w:sz w:val="22"/>
+      <w:szCs w:val="22"/>
+    </w:rPr>
+  </w:style>
+  <w:style w:type="paragraph" w:styleId="TOC3">
+    <w:name w:val="toc 3"/>
+    <w:basedOn w:val="Normal"/>
+    <w:next w:val="Normal"/>
+    <w:autoRedefine/>
+    <w:uiPriority w:val="39"/>
+    <w:semiHidden/>
+    <w:unhideWhenUsed/>
+    <w:rsid w:val="00734BCF"/>
+    <w:rPr>
+      <w:smallCaps/>
+      <w:sz w:val="22"/>
+      <w:szCs w:val="22"/>
+    </w:rPr>
+  </w:style>
+  <w:style w:type="paragraph" w:styleId="TOC4">
+    <w:name w:val="toc 4"/>
+    <w:basedOn w:val="Normal"/>
+    <w:next w:val="Normal"/>
+    <w:autoRedefine/>
+    <w:uiPriority w:val="39"/>
+    <w:semiHidden/>
+    <w:unhideWhenUsed/>
+    <w:rsid w:val="00734BCF"/>
+    <w:rPr>
+      <w:sz w:val="22"/>
+      <w:szCs w:val="22"/>
+    </w:rPr>
+  </w:style>
+  <w:style w:type="paragraph" w:styleId="TOC5">
+    <w:name w:val="toc 5"/>
+    <w:basedOn w:val="Normal"/>
+    <w:next w:val="Normal"/>
+    <w:autoRedefine/>
+    <w:uiPriority w:val="39"/>
+    <w:semiHidden/>
+    <w:unhideWhenUsed/>
+    <w:rsid w:val="00734BCF"/>
+    <w:rPr>
+      <w:sz w:val="22"/>
+      <w:szCs w:val="22"/>
+    </w:rPr>
+  </w:style>
+  <w:style w:type="paragraph" w:styleId="TOC6">
+    <w:name w:val="toc 6"/>
+    <w:basedOn w:val="Normal"/>
+    <w:next w:val="Normal"/>
+    <w:autoRedefine/>
+    <w:uiPriority w:val="39"/>
+    <w:semiHidden/>
+    <w:unhideWhenUsed/>
+    <w:rsid w:val="00734BCF"/>
+    <w:rPr>
+      <w:sz w:val="22"/>
+      <w:szCs w:val="22"/>
+    </w:rPr>
+  </w:style>
+  <w:style w:type="paragraph" w:styleId="TOC7">
+    <w:name w:val="toc 7"/>
+    <w:basedOn w:val="Normal"/>
+    <w:next w:val="Normal"/>
+    <w:autoRedefine/>
+    <w:uiPriority w:val="39"/>
+    <w:semiHidden/>
+    <w:unhideWhenUsed/>
+    <w:rsid w:val="00734BCF"/>
+    <w:rPr>
+      <w:sz w:val="22"/>
+      <w:szCs w:val="22"/>
+    </w:rPr>
+  </w:style>
+  <w:style w:type="paragraph" w:styleId="TOC8">
+    <w:name w:val="toc 8"/>
+    <w:basedOn w:val="Normal"/>
+    <w:next w:val="Normal"/>
+    <w:autoRedefine/>
+    <w:uiPriority w:val="39"/>
+    <w:semiHidden/>
+    <w:unhideWhenUsed/>
+    <w:rsid w:val="00734BCF"/>
+    <w:rPr>
+      <w:sz w:val="22"/>
+      <w:szCs w:val="22"/>
+    </w:rPr>
+  </w:style>
+  <w:style w:type="paragraph" w:styleId="TOC9">
+    <w:name w:val="toc 9"/>
+    <w:basedOn w:val="Normal"/>
+    <w:next w:val="Normal"/>
+    <w:autoRedefine/>
+    <w:uiPriority w:val="39"/>
+    <w:semiHidden/>
+    <w:unhideWhenUsed/>
+    <w:rsid w:val="00734BCF"/>
+    <w:rPr>
+      <w:sz w:val="22"/>
+      <w:szCs w:val="22"/>
+    </w:rPr>
+  </w:style>
 </w:styles>
 </file>
 

</xml_diff>